<commit_message>
Added FieldFox capture script
</commit_message>
<xml_diff>
--- a/Test Plans/AD/AD4080.docx
+++ b/Test Plans/AD/AD4080.docx
@@ -250,7 +250,10 @@
               <w:t xml:space="preserve">Orange </w:t>
             </w:r>
             <w:r>
-              <w:t>1.5v VIO</w:t>
+              <w:t>1.5v</w:t>
+            </w:r>
+            <w:r>
+              <w:t xml:space="preserve"> VDDLDO</w:t>
             </w:r>
           </w:p>
         </w:tc>
@@ -298,7 +301,10 @@
               <w:t>v</w:t>
             </w:r>
             <w:r>
-              <w:t xml:space="preserve"> VDDLDO</w:t>
+              <w:t xml:space="preserve"> </w:t>
+            </w:r>
+            <w:r>
+              <w:t>VIO</w:t>
             </w:r>
           </w:p>
         </w:tc>
@@ -347,6 +353,9 @@
               <w:pStyle w:val="ListParagraph"/>
               <w:ind w:left="0"/>
             </w:pPr>
+            <w:r>
+              <w:t>CH0 (4163 card)</w:t>
+            </w:r>
           </w:p>
         </w:tc>
       </w:tr>
@@ -872,25 +881,41 @@
           <w:tcPr>
             <w:tcW w:w="2358" w:type="dxa"/>
           </w:tcPr>
-          <w:p/>
+          <w:p>
+            <w:r>
+              <w:t>16mA</w:t>
+            </w:r>
+          </w:p>
         </w:tc>
         <w:tc>
           <w:tcPr>
             <w:tcW w:w="2629" w:type="dxa"/>
           </w:tcPr>
-          <w:p/>
+          <w:p>
+            <w:r>
+              <w:t>31mA</w:t>
+            </w:r>
+          </w:p>
         </w:tc>
         <w:tc>
           <w:tcPr>
             <w:tcW w:w="2563" w:type="dxa"/>
           </w:tcPr>
-          <w:p/>
+          <w:p>
+            <w:r>
+              <w:t>0</w:t>
+            </w:r>
+          </w:p>
         </w:tc>
         <w:tc>
           <w:tcPr>
             <w:tcW w:w="2069" w:type="dxa"/>
           </w:tcPr>
-          <w:p/>
+          <w:p>
+            <w:r>
+              <w:t>0</w:t>
+            </w:r>
+          </w:p>
         </w:tc>
       </w:tr>
     </w:tbl>
@@ -1900,6 +1925,7 @@
   <w:style w:type="character" w:default="1" w:styleId="DefaultParagraphFont">
     <w:name w:val="Default Paragraph Font"/>
     <w:uiPriority w:val="1"/>
+    <w:semiHidden/>
     <w:unhideWhenUsed/>
   </w:style>
   <w:style w:type="table" w:default="1" w:styleId="TableNormal">

</xml_diff>